<commit_message>
changes to the chart folder
</commit_message>
<xml_diff>
--- a/report/Synthetic_Fraud_Report.docx
+++ b/report/Synthetic_Fraud_Report.docx
@@ -342,18 +342,8 @@
           <w:sz w:val="24"/>
           <w:szCs w:val="24"/>
         </w:rPr>
-        <w:t xml:space="preserve">Number </w:t>
+        <w:t>Number of  transactions</w:t>
       </w:r>
-      <w:proofErr w:type="gramStart"/>
-      <w:r>
-        <w:rPr>
-          <w:rFonts w:ascii="Calibri" w:eastAsia="Calibri" w:hAnsi="Calibri" w:cs="Calibri"/>
-          <w:sz w:val="24"/>
-          <w:szCs w:val="24"/>
-        </w:rPr>
-        <w:t>of  transactions</w:t>
-      </w:r>
-      <w:proofErr w:type="gramEnd"/>
       <w:r>
         <w:rPr>
           <w:rFonts w:ascii="Calibri" w:eastAsia="Calibri" w:hAnsi="Calibri" w:cs="Calibri"/>
@@ -464,43 +454,7 @@
           <w:szCs w:val="24"/>
         </w:rPr>
         <w:tab/>
-        <w:t xml:space="preserve">: amount, </w:t>
-      </w:r>
-      <w:proofErr w:type="spellStart"/>
-      <w:r>
-        <w:rPr>
-          <w:rFonts w:ascii="Calibri" w:eastAsia="Calibri" w:hAnsi="Calibri" w:cs="Calibri"/>
-          <w:sz w:val="24"/>
-          <w:szCs w:val="24"/>
-        </w:rPr>
-        <w:t>is_fraudulent</w:t>
-      </w:r>
-      <w:proofErr w:type="spellEnd"/>
-      <w:r>
-        <w:rPr>
-          <w:rFonts w:ascii="Calibri" w:eastAsia="Calibri" w:hAnsi="Calibri" w:cs="Calibri"/>
-          <w:sz w:val="24"/>
-          <w:szCs w:val="24"/>
-        </w:rPr>
-        <w:t xml:space="preserve">, </w:t>
-      </w:r>
-      <w:proofErr w:type="spellStart"/>
-      <w:r>
-        <w:rPr>
-          <w:rFonts w:ascii="Calibri" w:eastAsia="Calibri" w:hAnsi="Calibri" w:cs="Calibri"/>
-          <w:sz w:val="24"/>
-          <w:szCs w:val="24"/>
-        </w:rPr>
-        <w:t>card_type</w:t>
-      </w:r>
-      <w:proofErr w:type="spellEnd"/>
-      <w:r>
-        <w:rPr>
-          <w:rFonts w:ascii="Calibri" w:eastAsia="Calibri" w:hAnsi="Calibri" w:cs="Calibri"/>
-          <w:sz w:val="24"/>
-          <w:szCs w:val="24"/>
-        </w:rPr>
-        <w:t xml:space="preserve">, location, </w:t>
+        <w:t xml:space="preserve">: amount, is_fraudulent, card_type, location, </w:t>
       </w:r>
       <w:r>
         <w:rPr>
@@ -518,7 +472,6 @@
         </w:rPr>
         <w:tab/>
       </w:r>
-      <w:proofErr w:type="gramStart"/>
       <w:r>
         <w:rPr>
           <w:rFonts w:ascii="Calibri" w:eastAsia="Calibri" w:hAnsi="Calibri" w:cs="Calibri"/>
@@ -542,27 +495,8 @@
           <w:sz w:val="24"/>
           <w:szCs w:val="24"/>
         </w:rPr>
-        <w:t>purchase</w:t>
+        <w:t>purchase category, customer_age</w:t>
       </w:r>
-      <w:proofErr w:type="gramEnd"/>
-      <w:r>
-        <w:rPr>
-          <w:rFonts w:ascii="Calibri" w:eastAsia="Calibri" w:hAnsi="Calibri" w:cs="Calibri"/>
-          <w:sz w:val="24"/>
-          <w:szCs w:val="24"/>
-        </w:rPr>
-        <w:t xml:space="preserve"> category, </w:t>
-      </w:r>
-      <w:proofErr w:type="spellStart"/>
-      <w:r>
-        <w:rPr>
-          <w:rFonts w:ascii="Calibri" w:eastAsia="Calibri" w:hAnsi="Calibri" w:cs="Calibri"/>
-          <w:sz w:val="24"/>
-          <w:szCs w:val="24"/>
-        </w:rPr>
-        <w:t>customer_age</w:t>
-      </w:r>
-      <w:proofErr w:type="spellEnd"/>
     </w:p>
     <w:p>
       <w:pPr>
@@ -1115,25 +1049,7 @@
           <w:sz w:val="24"/>
           <w:szCs w:val="24"/>
         </w:rPr>
-        <w:t>The card type “</w:t>
-      </w:r>
-      <w:proofErr w:type="gramStart"/>
-      <w:r>
-        <w:rPr>
-          <w:rFonts w:ascii="Calibri" w:eastAsia="Calibri" w:hAnsi="Calibri" w:cs="Calibri"/>
-          <w:sz w:val="24"/>
-          <w:szCs w:val="24"/>
-        </w:rPr>
-        <w:t>Discover</w:t>
-      </w:r>
-      <w:proofErr w:type="gramEnd"/>
-      <w:r>
-        <w:rPr>
-          <w:rFonts w:ascii="Calibri" w:eastAsia="Calibri" w:hAnsi="Calibri" w:cs="Calibri"/>
-          <w:sz w:val="24"/>
-          <w:szCs w:val="24"/>
-        </w:rPr>
-        <w:t>” had been used 2633 times, more than the competitors</w:t>
+        <w:t>The card type “Discover” had been used 2633 times, more than the competitors</w:t>
       </w:r>
     </w:p>
     <w:p>
@@ -1165,41 +1081,13 @@
           <w:szCs w:val="24"/>
         </w:rPr>
       </w:pPr>
-      <w:proofErr w:type="gramStart"/>
       <w:r>
         <w:rPr>
           <w:rFonts w:ascii="Calibri" w:eastAsia="Calibri" w:hAnsi="Calibri" w:cs="Calibri"/>
           <w:sz w:val="24"/>
           <w:szCs w:val="24"/>
         </w:rPr>
-        <w:t>Discover  made</w:t>
-      </w:r>
-      <w:proofErr w:type="gramEnd"/>
-      <w:r>
-        <w:rPr>
-          <w:rFonts w:ascii="Calibri" w:eastAsia="Calibri" w:hAnsi="Calibri" w:cs="Calibri"/>
-          <w:sz w:val="24"/>
-          <w:szCs w:val="24"/>
-        </w:rPr>
-        <w:t xml:space="preserve"> the most amount of transaction </w:t>
-      </w:r>
-      <w:proofErr w:type="spellStart"/>
-      <w:r>
-        <w:rPr>
-          <w:rFonts w:ascii="Calibri" w:eastAsia="Calibri" w:hAnsi="Calibri" w:cs="Calibri"/>
-          <w:sz w:val="24"/>
-          <w:szCs w:val="24"/>
-        </w:rPr>
-        <w:t>totalling</w:t>
-      </w:r>
-      <w:proofErr w:type="spellEnd"/>
-      <w:r>
-        <w:rPr>
-          <w:rFonts w:ascii="Calibri" w:eastAsia="Calibri" w:hAnsi="Calibri" w:cs="Calibri"/>
-          <w:sz w:val="24"/>
-          <w:szCs w:val="24"/>
-        </w:rPr>
-        <w:t xml:space="preserve"> in 13,319,807.23 dollars</w:t>
+        <w:t>Discover  made the most amount of transaction totalling in 13,319,807.23 dollars</w:t>
       </w:r>
     </w:p>
     <w:p>
@@ -1237,25 +1125,7 @@
           <w:sz w:val="24"/>
           <w:szCs w:val="24"/>
         </w:rPr>
-        <w:t xml:space="preserve">MasterCard </w:t>
-      </w:r>
-      <w:proofErr w:type="gramStart"/>
-      <w:r>
-        <w:rPr>
-          <w:rFonts w:ascii="Calibri" w:eastAsia="Calibri" w:hAnsi="Calibri" w:cs="Calibri"/>
-          <w:sz w:val="24"/>
-          <w:szCs w:val="24"/>
-        </w:rPr>
-        <w:t>has  0.521611</w:t>
-      </w:r>
-      <w:proofErr w:type="gramEnd"/>
-      <w:r>
-        <w:rPr>
-          <w:rFonts w:ascii="Calibri" w:eastAsia="Calibri" w:hAnsi="Calibri" w:cs="Calibri"/>
-          <w:sz w:val="24"/>
-          <w:szCs w:val="24"/>
-        </w:rPr>
-        <w:t xml:space="preserve"> fraud rate, which means 52.16% transaction is fraudulent using MasterCard</w:t>
+        <w:t>MasterCard has  0.521611 fraud rate, which means 52.16% transaction is fraudulent using MasterCard</w:t>
       </w:r>
     </w:p>
     <w:p>
@@ -1306,14 +1176,8 @@
           <w:sz w:val="24"/>
           <w:szCs w:val="24"/>
         </w:rPr>
-        <w:pPrChange w:id="3" w:author="Asus Vivobook" w:date="2026-06-22T13:54:00Z" w16du:dateUtc="2026-06-22T06:54:00Z">
-          <w:pPr>
-            <w:ind w:left="1440"/>
-            <w:jc w:val="both"/>
-          </w:pPr>
-        </w:pPrChange>
-      </w:pPr>
-      <w:ins w:id="4" w:author="Asus Vivobook" w:date="2026-06-22T13:54:00Z" w16du:dateUtc="2026-06-22T06:54:00Z">
+      </w:pPr>
+      <w:ins w:id="3" w:author="Asus Vivobook" w:date="2026-06-22T13:54:00Z" w16du:dateUtc="2026-06-22T06:54:00Z">
         <w:r>
           <w:rPr>
             <w:rFonts w:ascii="Calibri" w:eastAsia="Calibri" w:hAnsi="Calibri" w:cs="Calibri"/>
@@ -1433,14 +1297,14 @@
           <w:sz w:val="24"/>
           <w:szCs w:val="24"/>
         </w:rPr>
-        <w:pPrChange w:id="5" w:author="Asus Vivobook" w:date="2026-06-22T13:47:00Z" w16du:dateUtc="2026-06-22T06:47:00Z">
+        <w:pPrChange w:id="4" w:author="Asus Vivobook" w:date="2026-06-22T13:47:00Z" w16du:dateUtc="2026-06-22T06:47:00Z">
           <w:pPr>
             <w:ind w:left="1440"/>
             <w:jc w:val="both"/>
           </w:pPr>
         </w:pPrChange>
       </w:pPr>
-      <w:del w:id="6" w:author="Asus Vivobook" w:date="2026-06-22T13:47:00Z" w16du:dateUtc="2026-06-22T06:47:00Z">
+      <w:del w:id="5" w:author="Asus Vivobook" w:date="2026-06-22T13:47:00Z" w16du:dateUtc="2026-06-22T06:47:00Z">
         <w:r>
           <w:rPr>
             <w:noProof/>
@@ -1491,7 +1355,7 @@
         <w:ind w:left="1440"/>
         <w:jc w:val="both"/>
         <w:rPr>
-          <w:ins w:id="7" w:author="Asus Vivobook" w:date="2026-06-22T13:55:00Z" w16du:dateUtc="2026-06-22T06:55:00Z"/>
+          <w:ins w:id="6" w:author="Asus Vivobook" w:date="2026-06-22T13:55:00Z" w16du:dateUtc="2026-06-22T06:55:00Z"/>
           <w:rFonts w:ascii="Calibri" w:eastAsia="Calibri" w:hAnsi="Calibri" w:cs="Calibri"/>
           <w:sz w:val="24"/>
           <w:szCs w:val="24"/>
@@ -1514,14 +1378,14 @@
           <w:sz w:val="24"/>
           <w:szCs w:val="24"/>
         </w:rPr>
-        <w:pPrChange w:id="8" w:author="Asus Vivobook" w:date="2026-06-22T13:56:00Z" w16du:dateUtc="2026-06-22T06:56:00Z">
+        <w:pPrChange w:id="7" w:author="Asus Vivobook" w:date="2026-06-22T13:56:00Z" w16du:dateUtc="2026-06-22T06:56:00Z">
           <w:pPr>
             <w:ind w:left="1440"/>
             <w:jc w:val="both"/>
           </w:pPr>
         </w:pPrChange>
       </w:pPr>
-      <w:ins w:id="9" w:author="Asus Vivobook" w:date="2026-06-22T13:56:00Z" w16du:dateUtc="2026-06-22T06:56:00Z">
+      <w:ins w:id="8" w:author="Asus Vivobook" w:date="2026-06-22T13:56:00Z" w16du:dateUtc="2026-06-22T06:56:00Z">
         <w:r>
           <w:rPr>
             <w:rFonts w:ascii="Calibri" w:eastAsia="Calibri" w:hAnsi="Calibri" w:cs="Calibri"/>
@@ -1532,7 +1396,7 @@
           <w:t xml:space="preserve">       </w:t>
         </w:r>
       </w:ins>
-      <w:ins w:id="10" w:author="Asus Vivobook" w:date="2026-06-22T13:55:00Z" w16du:dateUtc="2026-06-22T06:55:00Z">
+      <w:ins w:id="9" w:author="Asus Vivobook" w:date="2026-06-22T13:55:00Z" w16du:dateUtc="2026-06-22T06:55:00Z">
         <w:r>
           <w:rPr>
             <w:noProof/>
@@ -1583,7 +1447,7 @@
         <w:ind w:left="1440"/>
         <w:jc w:val="both"/>
         <w:rPr>
-          <w:del w:id="11" w:author="Asus Vivobook" w:date="2026-06-22T13:52:00Z" w16du:dateUtc="2026-06-22T06:52:00Z"/>
+          <w:del w:id="10" w:author="Asus Vivobook" w:date="2026-06-22T13:52:00Z" w16du:dateUtc="2026-06-22T06:52:00Z"/>
           <w:rFonts w:ascii="Calibri" w:eastAsia="Calibri" w:hAnsi="Calibri" w:cs="Calibri"/>
           <w:sz w:val="24"/>
           <w:szCs w:val="24"/>
@@ -1622,7 +1486,7 @@
         <w:ind w:left="1440"/>
         <w:jc w:val="both"/>
         <w:rPr>
-          <w:ins w:id="12" w:author="Asus Vivobook" w:date="2026-06-22T13:52:00Z" w16du:dateUtc="2026-06-22T06:52:00Z"/>
+          <w:ins w:id="11" w:author="Asus Vivobook" w:date="2026-06-22T13:52:00Z" w16du:dateUtc="2026-06-22T06:52:00Z"/>
           <w:rFonts w:ascii="Calibri" w:eastAsia="Calibri" w:hAnsi="Calibri" w:cs="Calibri"/>
           <w:sz w:val="24"/>
           <w:szCs w:val="24"/>
@@ -1646,7 +1510,7 @@
           <w:szCs w:val="24"/>
         </w:rPr>
       </w:pPr>
-      <w:ins w:id="13" w:author="Asus Vivobook" w:date="2026-06-22T13:52:00Z" w16du:dateUtc="2026-06-22T06:52:00Z">
+      <w:ins w:id="12" w:author="Asus Vivobook" w:date="2026-06-22T13:52:00Z" w16du:dateUtc="2026-06-22T06:52:00Z">
         <w:r>
           <w:rPr>
             <w:rFonts w:ascii="Calibri" w:eastAsia="Calibri" w:hAnsi="Calibri" w:cs="Calibri"/>
@@ -1656,7 +1520,7 @@
           <w:t xml:space="preserve">   </w:t>
         </w:r>
       </w:ins>
-      <w:ins w:id="14" w:author="Asus Vivobook" w:date="2026-06-22T13:53:00Z" w16du:dateUtc="2026-06-22T06:53:00Z">
+      <w:ins w:id="13" w:author="Asus Vivobook" w:date="2026-06-22T13:53:00Z" w16du:dateUtc="2026-06-22T06:53:00Z">
         <w:r>
           <w:rPr>
             <w:rFonts w:ascii="Calibri" w:eastAsia="Calibri" w:hAnsi="Calibri" w:cs="Calibri"/>
@@ -1666,7 +1530,7 @@
           <w:t xml:space="preserve">       </w:t>
         </w:r>
       </w:ins>
-      <w:ins w:id="15" w:author="Asus Vivobook" w:date="2026-06-22T13:52:00Z" w16du:dateUtc="2026-06-22T06:52:00Z">
+      <w:ins w:id="14" w:author="Asus Vivobook" w:date="2026-06-22T13:52:00Z" w16du:dateUtc="2026-06-22T06:52:00Z">
         <w:r>
           <w:rPr>
             <w:rFonts w:ascii="Calibri" w:eastAsia="Calibri" w:hAnsi="Calibri" w:cs="Calibri"/>
@@ -1993,25 +1857,7 @@
           <w:sz w:val="20"/>
           <w:szCs w:val="20"/>
         </w:rPr>
-        <w:t xml:space="preserve">The data that is used is a synthetic financial </w:t>
-      </w:r>
-      <w:proofErr w:type="gramStart"/>
-      <w:r>
-        <w:rPr>
-          <w:rFonts w:ascii="Calibri" w:eastAsia="Calibri" w:hAnsi="Calibri" w:cs="Calibri"/>
-          <w:sz w:val="20"/>
-          <w:szCs w:val="20"/>
-        </w:rPr>
-        <w:t>data,</w:t>
-      </w:r>
-      <w:proofErr w:type="gramEnd"/>
-      <w:r>
-        <w:rPr>
-          <w:rFonts w:ascii="Calibri" w:eastAsia="Calibri" w:hAnsi="Calibri" w:cs="Calibri"/>
-          <w:sz w:val="20"/>
-          <w:szCs w:val="20"/>
-        </w:rPr>
-        <w:t xml:space="preserve"> here is the description:</w:t>
+        <w:t>The data that is used is a synthetic financial data, here is the description:</w:t>
       </w:r>
     </w:p>
     <w:p>

</xml_diff>